<commit_message>
Updated A requirement I missed
</commit_message>
<xml_diff>
--- a/docs/requirements/CivicConnect Stakeholder Analysis.docx
+++ b/docs/requirements/CivicConnect Stakeholder Analysis.docx
@@ -34,16 +34,8 @@
         <w:rPr>
           <w:lang w:val="en-US"/>
         </w:rPr>
-        <w:t xml:space="preserve"> </w:t>
-      </w:r>
-      <w:proofErr w:type="spellStart"/>
-      <w:r>
-        <w:rPr>
-          <w:lang w:val="en-US"/>
-        </w:rPr>
-        <w:t>CivicConnect</w:t>
-      </w:r>
-      <w:proofErr w:type="spellEnd"/>
+        <w:t xml:space="preserve"> CivicConnect</w:t>
+      </w:r>
     </w:p>
     <w:p>
       <w:pPr>
@@ -185,21 +177,7 @@
         <w:rPr>
           <w:lang w:val="en-US"/>
         </w:rPr>
-        <w:t xml:space="preserve">This stakeholder analysis identifies the people and organizational groups affected by </w:t>
-      </w:r>
-      <w:proofErr w:type="spellStart"/>
-      <w:r>
-        <w:rPr>
-          <w:lang w:val="en-US"/>
-        </w:rPr>
-        <w:t>CivicConnect</w:t>
-      </w:r>
-      <w:proofErr w:type="spellEnd"/>
-      <w:r>
-        <w:rPr>
-          <w:lang w:val="en-US"/>
-        </w:rPr>
-        <w:t>, their needs and expectations, their influence and interest in the project, and potential conflicts between stakeholder needs.</w:t>
+        <w:t>This stakeholder analysis identifies the people and organizational groups affected by CivicConnect, their needs and expectations, their influence and interest in the project, and potential conflicts between stakeholder needs.</w:t>
       </w:r>
     </w:p>
     <w:p>
@@ -246,19 +224,11 @@
           <w:lang w:val="en-US"/>
         </w:rPr>
       </w:pPr>
-      <w:proofErr w:type="spellStart"/>
-      <w:r>
-        <w:rPr>
-          <w:lang w:val="en-US"/>
-        </w:rPr>
-        <w:t>CivicConnect</w:t>
-      </w:r>
-      <w:proofErr w:type="spellEnd"/>
-      <w:r>
-        <w:rPr>
-          <w:lang w:val="en-US"/>
-        </w:rPr>
-        <w:t xml:space="preserve"> addresses the current fragmented management of community service requests. The organization currently relies on multiple communication and record-keeping channels, including email, telephone calls, WhatsApp messages, spreadsheets and paper-based records.</w:t>
+      <w:r>
+        <w:rPr>
+          <w:lang w:val="en-US"/>
+        </w:rPr>
+        <w:t>CivicConnect addresses the current fragmented management of community service requests. The organization currently relies on multiple communication and record-keeping channels, including email, telephone calls, WhatsApp messages, spreadsheets and paper-based records.</w:t>
       </w:r>
     </w:p>
     <w:p>
@@ -414,20 +384,12 @@
           <w:lang w:val="en-US"/>
         </w:rPr>
       </w:pPr>
-      <w:proofErr w:type="spellStart"/>
       <w:r>
         <w:rPr>
           <w:lang w:val="en-US"/>
         </w:rPr>
         <w:lastRenderedPageBreak/>
-        <w:t>CivicConnect</w:t>
-      </w:r>
-      <w:proofErr w:type="spellEnd"/>
-      <w:r>
-        <w:rPr>
-          <w:lang w:val="en-US"/>
-        </w:rPr>
-        <w:t xml:space="preserve"> should therefore establish a single controlled lifecycle for service requests. The intended business value is to:</w:t>
+        <w:t>CivicConnect should therefore establish a single controlled lifecycle for service requests. The intended business value is to:</w:t>
       </w:r>
     </w:p>
     <w:p>
@@ -1061,16 +1023,8 @@
               <w:rPr>
                 <w:lang w:val="en-US"/>
               </w:rPr>
-              <w:t xml:space="preserve">Engineers and maintains </w:t>
-            </w:r>
-            <w:proofErr w:type="spellStart"/>
-            <w:r>
-              <w:rPr>
-                <w:lang w:val="en-US"/>
-              </w:rPr>
-              <w:t>CivivConnect</w:t>
-            </w:r>
-            <w:proofErr w:type="spellEnd"/>
+              <w:t>Engineers and maintains CivivConnect</w:t>
+            </w:r>
           </w:p>
         </w:tc>
         <w:tc>
@@ -1317,19 +1271,11 @@
           <w:lang w:val="en-US"/>
         </w:rPr>
       </w:pPr>
-      <w:proofErr w:type="spellStart"/>
-      <w:r>
-        <w:rPr>
-          <w:lang w:val="en-US"/>
-        </w:rPr>
-        <w:t>Categorise</w:t>
-      </w:r>
-      <w:proofErr w:type="spellEnd"/>
-      <w:r>
-        <w:rPr>
-          <w:lang w:val="en-US"/>
-        </w:rPr>
-        <w:t xml:space="preserve"> the request using a controlled category mechanism</w:t>
+      <w:r>
+        <w:rPr>
+          <w:lang w:val="en-US"/>
+        </w:rPr>
+        <w:t>Categorise the request using a controlled category mechanism</w:t>
       </w:r>
     </w:p>
     <w:p>
@@ -1730,14 +1676,12 @@
           <w:lang w:val="en-US"/>
         </w:rPr>
       </w:pPr>
-      <w:proofErr w:type="spellStart"/>
-      <w:r>
-        <w:rPr>
-          <w:lang w:val="en-US"/>
-        </w:rPr>
-        <w:t>Traceablility</w:t>
-      </w:r>
-      <w:proofErr w:type="spellEnd"/>
+      <w:r>
+        <w:rPr>
+          <w:lang w:val="en-US"/>
+        </w:rPr>
+        <w:t>Traceability</w:t>
+      </w:r>
       <w:r>
         <w:rPr>
           <w:lang w:val="en-US"/>
@@ -1938,15 +1882,7 @@
     </w:p>
     <w:p>
       <w:r>
-        <w:t xml:space="preserve">Requesters are highly affected by the usability and visibility of </w:t>
-      </w:r>
-      <w:proofErr w:type="spellStart"/>
-      <w:r>
-        <w:t>CivicConnect</w:t>
-      </w:r>
-      <w:proofErr w:type="spellEnd"/>
-      <w:r>
-        <w:t>, although they may have less direct influence over project decisions.</w:t>
+        <w:t>Requesters are highly affected by the usability and visibility of CivicConnect, although they may have less direct influence over project decisions.</w:t>
       </w:r>
     </w:p>
     <w:p>
@@ -1967,15 +1903,7 @@
     </w:p>
     <w:p>
       <w:r>
-        <w:t xml:space="preserve">The assessor does not represent an operational user of </w:t>
-      </w:r>
-      <w:proofErr w:type="spellStart"/>
-      <w:r>
-        <w:t>CivicConnect</w:t>
-      </w:r>
-      <w:proofErr w:type="spellEnd"/>
-      <w:r>
-        <w:t xml:space="preserve"> but has significant influence over the assessment of the engineering evidence.</w:t>
+        <w:t>The assessor does not represent an operational user of CivicConnect but has significant influence over the assessment of the engineering evidence.</w:t>
       </w:r>
     </w:p>
     <w:p>
@@ -2075,21 +2003,7 @@
     </w:p>
     <w:p>
       <w:r>
-        <w:t xml:space="preserve">Management may benefit from increasingly detailed reporting, but every additional reporting feature </w:t>
-      </w:r>
-      <w:r>
-        <w:t>increase</w:t>
-      </w:r>
-      <w:r>
-        <w:t xml:space="preserve"> </w:t>
-      </w:r>
-      <w:proofErr w:type="gramStart"/>
-      <w:r>
-        <w:t>requirements</w:t>
-      </w:r>
-      <w:proofErr w:type="gramEnd"/>
-      <w:r>
-        <w:t>, implementation, testing and maintenance obligations.</w:t>
+        <w:t>Management may benefit from increasingly detailed reporting, but every additional reporting feature increase requirements, implementation, testing and maintenance obligations.</w:t>
       </w:r>
     </w:p>
     <w:p>
@@ -2810,6 +2724,58 @@
       </w:tr>
       <w:tr>
         <w:trPr>
+          <w:trHeight w:val="442"/>
+          <w:tblCellSpacing w:w="15" w:type="dxa"/>
+        </w:trPr>
+        <w:tc>
+          <w:tcPr>
+            <w:tcW w:w="0" w:type="auto"/>
+            <w:tcBorders>
+              <w:left w:val="single" w:sz="4" w:space="0" w:color="auto"/>
+              <w:bottom w:val="single" w:sz="4" w:space="0" w:color="auto"/>
+            </w:tcBorders>
+            <w:vAlign w:val="center"/>
+          </w:tcPr>
+          <w:p>
+            <w:r>
+              <w:t>Staff</w:t>
+            </w:r>
+          </w:p>
+        </w:tc>
+        <w:tc>
+          <w:tcPr>
+            <w:tcW w:w="0" w:type="auto"/>
+            <w:tcBorders>
+              <w:left w:val="single" w:sz="4" w:space="0" w:color="auto"/>
+              <w:bottom w:val="single" w:sz="4" w:space="0" w:color="auto"/>
+              <w:right w:val="single" w:sz="4" w:space="0" w:color="auto"/>
+            </w:tcBorders>
+            <w:vAlign w:val="center"/>
+          </w:tcPr>
+          <w:p>
+            <w:r>
+              <w:t>Resolve or Close requests</w:t>
+            </w:r>
+          </w:p>
+        </w:tc>
+        <w:tc>
+          <w:tcPr>
+            <w:tcW w:w="0" w:type="auto"/>
+            <w:tcBorders>
+              <w:bottom w:val="single" w:sz="4" w:space="0" w:color="auto"/>
+              <w:right w:val="single" w:sz="4" w:space="0" w:color="auto"/>
+            </w:tcBorders>
+            <w:vAlign w:val="center"/>
+          </w:tcPr>
+          <w:p>
+            <w:r>
+              <w:t>FR-011</w:t>
+            </w:r>
+          </w:p>
+        </w:tc>
+      </w:tr>
+      <w:tr>
+        <w:trPr>
           <w:trHeight w:val="426"/>
           <w:tblCellSpacing w:w="15" w:type="dxa"/>
         </w:trPr>
@@ -2855,7 +2821,10 @@
           </w:tcPr>
           <w:p>
             <w:r>
-              <w:t>FR-011</w:t>
+              <w:t>FR-01</w:t>
+            </w:r>
+            <w:r>
+              <w:t>2</w:t>
             </w:r>
           </w:p>
         </w:tc>
@@ -2913,7 +2882,10 @@
           </w:tcPr>
           <w:p>
             <w:r>
-              <w:t>FR-012</w:t>
+              <w:t>FR-01</w:t>
+            </w:r>
+            <w:r>
+              <w:t>3</w:t>
             </w:r>
           </w:p>
         </w:tc>
@@ -3097,21 +3069,7 @@
         <w:rPr>
           <w:lang w:val="en-US"/>
         </w:rPr>
-        <w:t xml:space="preserve">The primary operational stakeholders for </w:t>
-      </w:r>
-      <w:proofErr w:type="spellStart"/>
-      <w:r>
-        <w:rPr>
-          <w:lang w:val="en-US"/>
-        </w:rPr>
-        <w:t>CivicConnect</w:t>
-      </w:r>
-      <w:proofErr w:type="spellEnd"/>
-      <w:r>
-        <w:rPr>
-          <w:lang w:val="en-US"/>
-        </w:rPr>
-        <w:t xml:space="preserve"> are requesters, service staff and management/oversight. </w:t>
+        <w:t xml:space="preserve">The primary operational stakeholders for CivicConnect are requesters, service staff and management/oversight. </w:t>
       </w:r>
     </w:p>
     <w:p>
@@ -4663,6 +4621,7 @@
   <w:style w:type="character" w:default="1" w:styleId="DefaultParagraphFont">
     <w:name w:val="Default Paragraph Font"/>
     <w:uiPriority w:val="1"/>
+    <w:semiHidden/>
     <w:unhideWhenUsed/>
   </w:style>
   <w:style w:type="table" w:default="1" w:styleId="TableNormal">

</xml_diff>